<commit_message>
Hafta 2'deki 5 kırık iç bağlantıyı düzelt
Tam site derlemesi (mkdocs build) üç kırık anchor bildirdi: bölüm numaraları bir ara
kaydırılmış ama bağlantılar eski numaralarda kalmış, bir tanesi de 'demo-6' yerine
'demo-06' olmalıymış. Öğrenci tıklayınca hiçbir yere gitmiyordu — dersin "bilgiler
arası bağı koru" kuralının ihlali.

- #4-yayilma-... -> #demo-01-imza-polimorfizm-sezgisel-analiz-emulasyon (1)
- #5-karsi-onlemler-... -> #demo-02-entropi-olcer-... (3)
- #demo-6-toctou-yaris-durumu -> #demo-06-toctou-yaris-durumu (1)

Bağlantı metinleri demo adı olduğu için doğrudan ilgili demo bölümlerine bağlandı.
Gerçek anchor kimlikleri derlenmiş HTML'den alındı (tahmin edilmedi). Yeniden
derlemede kırık bağlantı kalmadı; hafta 2 ders notu PDF/DOCX ve ZIP yenilendi.
</commit_message>
<xml_diff>
--- a/docs/week-2/cen429-week-2-ders-notu.en.docx
+++ b/docs/week-2/cen429-week-2-ders-notu.en.docx
@@ -5073,7 +5073,7 @@
       <w:r>
         <w:t xml:space="preserve"> </w:t>
       </w:r>
-      <w:hyperlink w:anchor="Xa9779df7f68a8fe0c5e898572ea879119790b91">
+      <w:hyperlink w:anchor="Xd2c8ecf281ae819b3ec13a8ca723c37c7780f0d">
         <w:r>
           <w:rPr>
             <w:rStyle w:val="Hyperlink"/>
@@ -5265,7 +5265,7 @@
       <w:r>
         <w:t xml:space="preserve"> </w:t>
       </w:r>
-      <w:hyperlink w:anchor="X47c925b3be3ae325145f3e98f5271a4ea7a8f2d">
+      <w:hyperlink w:anchor="X4723d3d9eefa717246993f55d42efcec28ae2e7">
         <w:r>
           <w:rPr>
             <w:rStyle w:val="Hyperlink"/>
@@ -6071,7 +6071,7 @@
       <w:r>
         <w:t xml:space="preserve"> </w:t>
       </w:r>
-      <w:hyperlink w:anchor="X47c925b3be3ae325145f3e98f5271a4ea7a8f2d">
+      <w:hyperlink w:anchor="X4723d3d9eefa717246993f55d42efcec28ae2e7">
         <w:r>
           <w:rPr>
             <w:rStyle w:val="Hyperlink"/>
@@ -7784,7 +7784,7 @@
       <w:r>
         <w:t xml:space="preserve"> </w:t>
       </w:r>
-      <w:hyperlink w:anchor="X47c925b3be3ae325145f3e98f5271a4ea7a8f2d">
+      <w:hyperlink w:anchor="X4723d3d9eefa717246993f55d42efcec28ae2e7">
         <w:r>
           <w:rPr>
             <w:rStyle w:val="Hyperlink"/>
@@ -18075,7 +18075,7 @@
       <w:r>
         <w:t xml:space="preserve"> </w:t>
       </w:r>
-      <w:hyperlink w:anchor="demo-6-toctou-yaris-durumu">
+      <w:hyperlink w:anchor="demo-06-toctou-yaris-durumu">
         <w:r>
           <w:rPr>
             <w:rStyle w:val="Hyperlink"/>

</xml_diff>